<commit_message>
Word finales de Jacqueline y hoja de arranque de referidos (sin _v2)
Co-Authored-By: Claude Fable 5.1 <noreply@anthropic.com>
</commit_message>
<xml_diff>
--- a/documentos_operativos/politicas/INSTRUCCIONES_JACQUELINE_ASISTENCIA_B1_Y_PUNTUALIDAD_2026-10-14.docx
+++ b/documentos_operativos/politicas/INSTRUCCIONES_JACQUELINE_ASISTENCIA_B1_Y_PUNTUALIDAD_2026-10-14.docx
@@ -96,7 +96,7 @@
               <w:br/>
               <w:t>2. ¿Vuelves mañana a las 8:00?</w:t>
               <w:br/>
-              <w:t>3. ¿Hay algo del cambio que te complique: la hora, el profe nuevo, el ritmo? Dímelo con confianza, para eso te llamo."</w:t>
+              <w:t>3. ¿Hay algo del cambio que te complique: el profe nuevo, el ritmo, el acento? Dímelo con confianza, para eso te llamo."</w:t>
               <w:br/>
               <w:t>Cierre: "Te esperamos mañana a las 8:00. Tu avance queda registrado y tu garantía depende de tu asistencia; por eso te llamo hoy y no en un mes."</w:t>
             </w:r>
@@ -848,42 +848,6 @@
                 <w:sz w:val="19"/>
               </w:rPr>
               <w:t>No se baja el ritmo. Se le recuerda el trato: el ritmo existe por la garantía por escrito; si cumple y no avanza, se le devuelve el nivel. Se le ofrece hablar 10 minutos con el docente actual al final de la clase de mañana.</w:t>
-            </w:r>
-          </w:p>
-        </w:tc>
-      </w:tr>
-      <w:tr>
-        <w:tc>
-          <w:tcPr>
-            <w:tcW w:type="dxa" w:w="2268"/>
-            <w:shd w:val="clear" w:color="auto" w:fill="FFF8E7"/>
-          </w:tcPr>
-          <w:p>
-            <w:pPr>
-              <w:spacing w:after="0"/>
-            </w:pPr>
-            <w:r>
-              <w:rPr>
-                <w:b/>
-                <w:sz w:val="19"/>
-              </w:rPr>
-              <w:t>La hora de las 8:00</w:t>
-            </w:r>
-          </w:p>
-        </w:tc>
-        <w:tc>
-          <w:tcPr>
-            <w:tcW w:type="dxa" w:w="7483"/>
-          </w:tcPr>
-          <w:p>
-            <w:pPr>
-              <w:spacing w:after="0"/>
-            </w:pPr>
-            <w:r>
-              <w:rPr>
-                <w:sz w:val="19"/>
-              </w:rPr>
-              <w:t>No se negocia: se matricularon a las 8:00 y ese es su horario. Se le dice con claridad: "Tu horario es el de las 8:00, el que elegiste al matricularte. Lo que sí hacemos es acompañarte para que no te cueste venir."</w:t>
             </w:r>
           </w:p>
         </w:tc>

</xml_diff>

<commit_message>
Instrucciones Jacqueline: el docente actual ya se presento; sin re-presentacion
Co-Authored-By: Claude Fable 5.1 <noreply@anthropic.com>
</commit_message>
<xml_diff>
--- a/documentos_operativos/politicas/INSTRUCCIONES_JACQUELINE_ASISTENCIA_B1_Y_PUNTUALIDAD_2026-10-14.docx
+++ b/documentos_operativos/politicas/INSTRUCCIONES_JACQUELINE_ASISTENCIA_B1_Y_PUNTUALIDAD_2026-10-14.docx
@@ -811,7 +811,7 @@
               <w:rPr>
                 <w:sz w:val="19"/>
               </w:rPr>
-              <w:t>Hoy: el docente anterior manda un audio de 30 segundos al grupo (texto abajo). Mañana: el docente actual se presenta 5 minutos antes de empezar la guía, sin pedir disculpas por nada: quién es, cómo trabaja, qué espera de ellos.</w:t>
+              <w:t>Hoy: el docente anterior manda un audio de 30 segundos al grupo (texto abajo). El docente actual ya se presentó el martes: no se vuelve a presentar ni pide disculpas por nada; al que faltó y vuelve, una frase de bienvenida y a la guía.</w:t>
             </w:r>
           </w:p>
         </w:tc>
@@ -1016,19 +1016,6 @@
       <w:pPr>
         <w:spacing w:after="0"/>
       </w:pPr>
-    </w:p>
-    <w:p>
-      <w:pPr>
-        <w:spacing w:after="60"/>
-      </w:pPr>
-      <w:r>
-        <w:rPr>
-          <w:b w:val="0"/>
-          <w:color w:val="666666"/>
-          <w:sz w:val="19"/>
-        </w:rPr>
-        <w:t>Presentación del docente actual (mañana, 5 minutos, antes de la guía): quién es, dónde aprendió, cómo trabaja (de pie, hablando, corrigiendo), qué espera (video diario, tarea, puntualidad) y una frase de cierre: "Mi trabajo es que salgan hablando; el de ustedes, venir y entrenar". Sin disculparse por el acento ni por el cambio.</w:t>
-      </w:r>
     </w:p>
     <w:p>
       <w:pPr>
@@ -1831,25 +1818,6 @@
         <w:rPr>
           <w:sz w:val="20"/>
         </w:rPr>
-        <w:t>Avisar al docente actual que mañana abre con 5 minutos de presentación.</w:t>
-      </w:r>
-    </w:p>
-    <w:p>
-      <w:pPr>
-        <w:spacing w:after="30"/>
-        <w:ind w:left="227"/>
-      </w:pPr>
-      <w:r>
-        <w:rPr>
-          <w:b/>
-          <w:sz w:val="20"/>
-        </w:rPr>
-        <w:t xml:space="preserve">☐ </w:t>
-      </w:r>
-      <w:r>
-        <w:rPr>
-          <w:sz w:val="20"/>
-        </w:rPr>
         <w:t>Enviar el mensaje de puntualidad al grupo de docentes (lo manda Diana).</w:t>
       </w:r>
     </w:p>

</xml_diff>

<commit_message>
Instrucciones Jacqueline: respuestas a 'no tengo tiempo' y 'me da pena'; PDF al dia
Co-Authored-By: Claude Fable 5.1 <noreply@anthropic.com>
</commit_message>
<xml_diff>
--- a/documentos_operativos/politicas/INSTRUCCIONES_JACQUELINE_ASISTENCIA_B1_Y_PUNTUALIDAD_2026-10-14.docx
+++ b/documentos_operativos/politicas/INSTRUCCIONES_JACQUELINE_ASISTENCIA_B1_Y_PUNTUALIDAD_2026-10-14.docx
@@ -831,7 +831,7 @@
                 <w:b/>
                 <w:sz w:val="19"/>
               </w:rPr>
-              <w:t>El ritmo o la exigencia</w:t>
+              <w:t>El ritmo o la exigencia (confirmado hoy por el docente: "no tienen tiempo", "les da pena")</w:t>
             </w:r>
           </w:p>
         </w:tc>
@@ -847,7 +847,79 @@
               <w:rPr>
                 <w:sz w:val="19"/>
               </w:rPr>
-              <w:t>No se baja el ritmo. Se le recuerda el trato: el ritmo existe por la garantía por escrito; si cumple y no avanza, se le devuelve el nivel. Se le ofrece hablar 10 minutos con el docente actual al final de la clase de mañana.</w:t>
+              <w:t>No se baja el ritmo. Se le recuerda el trato: el ritmo existe por la garantía por escrito; si cumple y no avanza, se le devuelve el nivel.</w:t>
+            </w:r>
+          </w:p>
+        </w:tc>
+      </w:tr>
+      <w:tr>
+        <w:tc>
+          <w:tcPr>
+            <w:tcW w:type="dxa" w:w="2268"/>
+            <w:shd w:val="clear" w:color="auto" w:fill="FFF8E7"/>
+          </w:tcPr>
+          <w:p>
+            <w:pPr>
+              <w:spacing w:after="0"/>
+            </w:pPr>
+            <w:r>
+              <w:rPr>
+                <w:b/>
+                <w:sz w:val="19"/>
+              </w:rPr>
+              <w:t>"No tengo tiempo"</w:t>
+            </w:r>
+          </w:p>
+        </w:tc>
+        <w:tc>
+          <w:tcPr>
+            <w:tcW w:type="dxa" w:w="7483"/>
+          </w:tcPr>
+          <w:p>
+            <w:pPr>
+              <w:spacing w:after="0"/>
+            </w:pPr>
+            <w:r>
+              <w:rPr>
+                <w:sz w:val="19"/>
+              </w:rPr>
+              <w:t>"Son 3 minutos de video al día; la preparación son 20 o 30 minutos. Y desde mañana la tarea escrita de Gramática se acorta a la mitad: 15 o 20 minutos. En total, menos de una hora al día. Lo que no existe es aprender inglés sin hablar todos los días; eso ya lo sabe por lo que intentó antes."</w:t>
+            </w:r>
+          </w:p>
+        </w:tc>
+      </w:tr>
+      <w:tr>
+        <w:tc>
+          <w:tcPr>
+            <w:tcW w:type="dxa" w:w="2268"/>
+            <w:shd w:val="clear" w:color="auto" w:fill="FFF8E7"/>
+          </w:tcPr>
+          <w:p>
+            <w:pPr>
+              <w:spacing w:after="0"/>
+            </w:pPr>
+            <w:r>
+              <w:rPr>
+                <w:b/>
+                <w:sz w:val="19"/>
+              </w:rPr>
+              <w:t>"Me da pena"</w:t>
+            </w:r>
+          </w:p>
+        </w:tc>
+        <w:tc>
+          <w:tcPr>
+            <w:tcW w:type="dxa" w:w="7483"/>
+          </w:tcPr>
+          <w:p>
+            <w:pPr>
+              <w:spacing w:after="0"/>
+            </w:pPr>
+            <w:r>
+              <w:rPr>
+                <w:sz w:val="19"/>
+              </w:rPr>
+              <w:t>"El video lo ve solo el profe, nadie de la clase. Y es exactamente para eso: la pena se gasta ahí, no delante de un jefe o un entrevistador. Desde mañana el video empieza con 3 frases que usted copia de alguien en internet; no arranca en blanco."</w:t>
             </w:r>
           </w:p>
         </w:tc>

</xml_diff>

<commit_message>
B1 manana: el 1 a 1 lo hace Juan Diego (hoja nueva, 1 pag); Jacqueline registra y cierra; referidos: retencion aparte
Co-Authored-By: Claude Fable 5.1 <noreply@anthropic.com>
</commit_message>
<xml_diff>
--- a/documentos_operativos/politicas/INSTRUCCIONES_JACQUELINE_ASISTENCIA_B1_Y_PUNTUALIDAD_2026-10-14.docx
+++ b/documentos_operativos/politicas/INSTRUCCIONES_JACQUELINE_ASISTENCIA_B1_Y_PUNTUALIDAD_2026-10-14.docx
@@ -39,7 +39,7 @@
           <w:color w:val="E54C09"/>
           <w:sz w:val="23"/>
         </w:rPr>
-        <w:t>PARTE 1 — EL B1 DE LA MAÑANA (4 estudiantes): averiguar la causa HOY, no suponerla</w:t>
+        <w:t>PARTE 1 — EL B1 DE LA MAÑANA (4 estudiantes): el 1 a 1 lo hace Juan Diego; Jacqueline registra y cierra</w:t>
       </w:r>
     </w:p>
     <w:p>
@@ -51,75 +51,64 @@
           <w:b/>
           <w:sz w:val="20"/>
         </w:rPr>
-        <w:t>El grupo cambió de docente el lunes 13 y hay estudiantes que no están llegando. Con 4 estudiantes, cada ausencia es el 25% del grupo. Hoy mismo, antes de las 5:00 p.m., Jacqueline llama a CADA ausente (llamada, no mensaje; si no contesta, un mensaje y se reintenta mañana a las 9:00 a.m.).</w:t>
+        <w:t>El grupo cambió de docente el lunes 13 y hay estudiantes que no están llegando. Con 4 estudiantes, cada ausencia es el 25% del grupo. Diana decidió que Juan Diego, que abrió el grupo, hable HOY con cada uno en un 1 a 1 (él tiene su propia hoja). Jacqueline no llama a los estudiantes; hace tres cosas con hora:</w:t>
       </w:r>
     </w:p>
     <w:p>
       <w:pPr>
-        <w:spacing w:after="20"/>
+        <w:spacing w:after="30"/>
+        <w:ind w:left="227"/>
       </w:pPr>
       <w:r>
         <w:rPr>
           <w:b/>
           <w:sz w:val="20"/>
         </w:rPr>
-        <w:t>Guion de la llamada (3 preguntas, se anotan las respuestas tal cual):</w:t>
+        <w:t xml:space="preserve">1. Antes de la 1:00 p.m.: </w:t>
       </w:r>
-    </w:p>
-    <w:tbl>
-      <w:tblPr>
-        <w:tblStyle w:val="TableGrid"/>
-        <w:tblW w:type="auto" w:w="0"/>
-        <w:tblLook w:firstColumn="1" w:firstRow="1" w:lastColumn="0" w:lastRow="0" w:noHBand="0" w:noVBand="1" w:val="04A0"/>
-      </w:tblPr>
-      <w:tblGrid>
-        <w:gridCol w:w="10200"/>
-      </w:tblGrid>
-      <w:tr>
-        <w:tc>
-          <w:tcPr>
-            <w:tcW w:type="dxa" w:w="10200"/>
-            <w:shd w:val="clear" w:color="auto" w:fill="FFF8E7"/>
-          </w:tcPr>
-          <w:p>
-            <w:pPr>
-              <w:spacing w:after="0"/>
-            </w:pPr>
-            <w:r>
-              <w:rPr>
-                <w:i/>
-                <w:sz w:val="19"/>
-              </w:rPr>
-              <w:t>"Hola [nombre], te habla [nombre], de Heiiu. Te llamo porque no te vimos en clase y queremos saber cómo estás.</w:t>
-              <w:br/>
-              <w:t>1. ¿Qué pasó hoy?</w:t>
-              <w:br/>
-              <w:t>2. ¿Vuelves mañana a las 8:00?</w:t>
-              <w:br/>
-              <w:t>3. ¿Hay algo del cambio que te complique: el profe nuevo, el ritmo, el acento? Dímelo con confianza, para eso te llamo."</w:t>
-              <w:br/>
-              <w:t>Cierre: "Te esperamos mañana a las 8:00. Tu avance queda registrado y tu garantía depende de tu asistencia; por eso te llamo hoy y no en un mes."</w:t>
-            </w:r>
-          </w:p>
-        </w:tc>
-      </w:tr>
-    </w:tbl>
-    <w:p>
-      <w:pPr>
-        <w:spacing w:after="0"/>
-      </w:pPr>
+      <w:r>
+        <w:rPr>
+          <w:sz w:val="20"/>
+        </w:rPr>
+        <w:t>Le pasa a Juan Diego la lista de los 4 con la asistencia del lunes y el martes y el celular de cada uno.</w:t>
+      </w:r>
     </w:p>
     <w:p>
       <w:pPr>
-        <w:spacing w:after="60"/>
+        <w:spacing w:after="30"/>
+        <w:ind w:left="227"/>
       </w:pPr>
       <w:r>
         <w:rPr>
-          <w:b w:val="0"/>
-          <w:color w:val="666666"/>
-          <w:sz w:val="19"/>
+          <w:b/>
+          <w:sz w:val="20"/>
         </w:rPr>
-        <w:t>Lo que NO se dice esta semana: amenazas con el contrato, "si no vienes pierdes la garantía", ni "el profe anterior ya no está". Se escucha y se anota.</w:t>
+        <w:t xml:space="preserve">2. A las 5:00 p.m.: </w:t>
+      </w:r>
+      <w:r>
+        <w:rPr>
+          <w:sz w:val="20"/>
+        </w:rPr>
+        <w:t>Recibe de Juan Diego, por escrito, una línea por estudiante (causa en sus palabras y si vuelve mañana) y llena la tabla de abajo. Si a las 5:00 no ha llegado, se la pide.</w:t>
+      </w:r>
+    </w:p>
+    <w:p>
+      <w:pPr>
+        <w:spacing w:after="30"/>
+        <w:ind w:left="227"/>
+      </w:pPr>
+      <w:r>
+        <w:rPr>
+          <w:b/>
+          <w:sz w:val="20"/>
+        </w:rPr>
+        <w:t xml:space="preserve">3. Después: </w:t>
+      </w:r>
+      <w:r>
+        <w:rPr>
+          <w:sz w:val="20"/>
+        </w:rPr>
+        <w:t>Lo que el 1 a 1 no resuelve lo toma Jacqueline con la tabla de causas: dinero, sin contacto, o un estudiante que escriba después pidiendo cambiar la hora o bajar el ritmo.</w:t>
       </w:r>
     </w:p>
     <w:tbl>
@@ -210,7 +199,7 @@
                 <w:color w:val="FFFFFF"/>
                 <w:sz w:val="18"/>
               </w:rPr>
-              <w:t>Llamado (hora)</w:t>
+              <w:t>1 a 1 (hora)</w:t>
             </w:r>
           </w:p>
         </w:tc>
@@ -229,7 +218,7 @@
                 <w:color w:val="FFFFFF"/>
                 <w:sz w:val="18"/>
               </w:rPr>
-              <w:t>Causa (sus palabras)</w:t>
+              <w:t>Causa (según Juan Diego)</w:t>
             </w:r>
           </w:p>
         </w:tc>
@@ -267,7 +256,7 @@
                 <w:color w:val="FFFFFF"/>
                 <w:sz w:val="18"/>
               </w:rPr>
-              <w:t>Acción</w:t>
+              <w:t>Acción de Jacqueline</w:t>
             </w:r>
           </w:p>
         </w:tc>
@@ -727,7 +716,7 @@
           <w:b/>
           <w:sz w:val="20"/>
         </w:rPr>
-        <w:t>Qué hacer según la causa (la decisión la toma Jacqueline):</w:t>
+        <w:t>Qué responde Jacqueline según la causa (cuando el estudiante le escriba a ella o cuando Juan Diego le reporte algo pendiente):</w:t>
       </w:r>
     </w:p>
     <w:tbl>
@@ -811,7 +800,7 @@
               <w:rPr>
                 <w:sz w:val="19"/>
               </w:rPr>
-              <w:t>Hoy: el docente anterior manda un audio de 30 segundos al grupo (texto abajo). El docente actual ya se presentó el martes: no se vuelve a presentar ni pide disculpas por nada; al que faltó y vuelve, una frase de bienvenida y a la guía.</w:t>
+              <w:t>Lo cierra Juan Diego en el 1 a 1. El docente actual ya se presentó el martes: no se vuelve a presentar ni pide disculpas por nada; al que faltó y vuelve, una frase de bienvenida y a la guía.</w:t>
             </w:r>
           </w:p>
         </w:tc>
@@ -975,6 +964,42 @@
                 <w:b/>
                 <w:sz w:val="19"/>
               </w:rPr>
+              <w:t>Pide cambiar la hora de las 8:00</w:t>
+            </w:r>
+          </w:p>
+        </w:tc>
+        <w:tc>
+          <w:tcPr>
+            <w:tcW w:type="dxa" w:w="7483"/>
+          </w:tcPr>
+          <w:p>
+            <w:pPr>
+              <w:spacing w:after="0"/>
+            </w:pPr>
+            <w:r>
+              <w:rPr>
+                <w:sz w:val="19"/>
+              </w:rPr>
+              <w:t>No se pregunta ni se negocia: matricularon a las 8:00 y ese es su horario. "Su horario es el de las 8:00, el que eligió al matricularse."</w:t>
+            </w:r>
+          </w:p>
+        </w:tc>
+      </w:tr>
+      <w:tr>
+        <w:tc>
+          <w:tcPr>
+            <w:tcW w:type="dxa" w:w="2268"/>
+            <w:shd w:val="clear" w:color="auto" w:fill="FFF8E7"/>
+          </w:tcPr>
+          <w:p>
+            <w:pPr>
+              <w:spacing w:after="0"/>
+            </w:pPr>
+            <w:r>
+              <w:rPr>
+                <w:b/>
+                <w:sz w:val="19"/>
+              </w:rPr>
               <w:t>Algo personal (trabajo, salud, dinero)</w:t>
             </w:r>
           </w:p>
@@ -1011,7 +1036,7 @@
                 <w:b/>
                 <w:sz w:val="19"/>
               </w:rPr>
-              <w:t>No contesta ni hoy ni mañana</w:t>
+              <w:t>Juan Diego no logró contacto hoy ni mañana</w:t>
             </w:r>
           </w:p>
         </w:tc>
@@ -1027,7 +1052,7 @@
               <w:rPr>
                 <w:sz w:val="19"/>
               </w:rPr>
-              <w:t>Mensaje escrito el jueves con la frase de garantía y asistencia. Se reporta a gerencia como "sin contacto".</w:t>
+              <w:t>Mensaje escrito de Jacqueline el jueves con la frase de garantía y asistencia. Se reporta a Diana como "sin contacto".</w:t>
             </w:r>
           </w:p>
         </w:tc>
@@ -1047,58 +1072,7 @@
           <w:b/>
           <w:sz w:val="20"/>
         </w:rPr>
-        <w:t>Audio del docente anterior al grupo (lo graba él hoy; Jacqueline se lo pide y lo reenvía si él no está en el grupo):</w:t>
-      </w:r>
-    </w:p>
-    <w:tbl>
-      <w:tblPr>
-        <w:tblStyle w:val="TableGrid"/>
-        <w:tblW w:type="auto" w:w="0"/>
-        <w:tblLook w:firstColumn="1" w:firstRow="1" w:lastColumn="0" w:lastRow="0" w:noHBand="0" w:noVBand="1" w:val="04A0"/>
-      </w:tblPr>
-      <w:tblGrid>
-        <w:gridCol w:w="10200"/>
-      </w:tblGrid>
-      <w:tr>
-        <w:tc>
-          <w:tcPr>
-            <w:tcW w:type="dxa" w:w="10200"/>
-            <w:shd w:val="clear" w:color="auto" w:fill="FFF8E7"/>
-          </w:tcPr>
-          <w:p>
-            <w:pPr>
-              <w:spacing w:after="0"/>
-            </w:pPr>
-            <w:r>
-              <w:rPr>
-                <w:i/>
-                <w:sz w:val="19"/>
-              </w:rPr>
-              <w:t>"Hola, equipo. Les hablo porque este grupo lo empecé yo y me importa cómo les va. Desde esta semana su profe de gramática es [nombre]:</w:t>
-              <w:br/>
-              <w:t>lo conozco, sabe lo que hace y va a exigirles lo mismo que yo, porque ustedes pueden. Yo sigo en la academia y nos vamos a cruzar.</w:t>
-              <w:br/>
-              <w:t>Lo único que les pido es que no falten: cada clase que se pierden es más difícil de recuperar que de asistir. Nos vemos."</w:t>
-            </w:r>
-          </w:p>
-        </w:tc>
-      </w:tr>
-    </w:tbl>
-    <w:p>
-      <w:pPr>
-        <w:spacing w:after="0"/>
-      </w:pPr>
-    </w:p>
-    <w:p>
-      <w:pPr>
-        <w:spacing w:after="20"/>
-      </w:pPr>
-      <w:r>
-        <w:rPr>
-          <w:b/>
-          <w:sz w:val="20"/>
-        </w:rPr>
-        <w:t>Mensaje de Jacqueline al grupo del B1 (hoy, después de las llamadas; también sirve como cierre de cada llamada):</w:t>
+        <w:t>Mensaje de Jacqueline al grupo del B1 (hoy, después de que Juan Diego reporte los 1 a 1):</w:t>
       </w:r>
     </w:p>
     <w:tbl>
@@ -1799,7 +1773,7 @@
                 <w:i/>
                 <w:sz w:val="19"/>
               </w:rPr>
-              <w:t>"B1 mañana: [x]/4 asistieron · ausentes llamados: [x] · causas: [palabra por cada uno] · docentes a tiempo hoy: [x]/[x]"</w:t>
+              <w:t>"B1 mañana: [x]/4 asistieron · 1 a 1 hechos por Juan Diego: [x] · causas: [palabra por cada uno] · docentes a tiempo hoy: [x]/[x]"</w:t>
             </w:r>
           </w:p>
         </w:tc>
@@ -1852,7 +1826,7 @@
         <w:rPr>
           <w:sz w:val="20"/>
         </w:rPr>
-        <w:t>Llamar a cada ausente del B1 antes de las 5:00 p.m. y llenar la tabla.</w:t>
+        <w:t>Antes de la 1:00 p.m.: lista de los 4 (asistencia lun/mar + celular) a Juan Diego.</w:t>
       </w:r>
     </w:p>
     <w:p>
@@ -1871,7 +1845,26 @@
         <w:rPr>
           <w:sz w:val="20"/>
         </w:rPr>
-        <w:t>Pedir hoy el audio al docente anterior y reenviarlo al grupo del B1.</w:t>
+        <w:t>A las 5:00 p.m.: recibir de Juan Diego la línea por estudiante y llenar la tabla.</w:t>
+      </w:r>
+    </w:p>
+    <w:p>
+      <w:pPr>
+        <w:spacing w:after="30"/>
+        <w:ind w:left="227"/>
+      </w:pPr>
+      <w:r>
+        <w:rPr>
+          <w:b/>
+          <w:sz w:val="20"/>
+        </w:rPr>
+        <w:t xml:space="preserve">☐ </w:t>
+      </w:r>
+      <w:r>
+        <w:rPr>
+          <w:sz w:val="20"/>
+        </w:rPr>
+        <w:t>Mensaje al grupo del B1 (Parte 1) hoy, después del reporte de Juan Diego.</w:t>
       </w:r>
     </w:p>
     <w:p>
@@ -1891,25 +1884,6 @@
           <w:sz w:val="20"/>
         </w:rPr>
         <w:t>Enviar el mensaje de puntualidad al grupo de docentes (lo manda Diana).</w:t>
-      </w:r>
-    </w:p>
-    <w:p>
-      <w:pPr>
-        <w:spacing w:after="30"/>
-        <w:ind w:left="227"/>
-      </w:pPr>
-      <w:r>
-        <w:rPr>
-          <w:b/>
-          <w:sz w:val="20"/>
-        </w:rPr>
-        <w:t xml:space="preserve">☐ </w:t>
-      </w:r>
-      <w:r>
-        <w:rPr>
-          <w:sz w:val="20"/>
-        </w:rPr>
-        <w:t>Mensaje al grupo del B1 (Parte 1) hoy, después de las llamadas.</w:t>
       </w:r>
     </w:p>
     <w:p>

</xml_diff>

<commit_message>
Jacqueline: el 1 a 1 ya lo hizo Juan Diego; ahora registra asistencia del mie 15 y llama a las 9:00; se retira hoja de 1 a 1 y se revierte regla en referidos
Co-Authored-By: Claude Fable 5.1 <noreply@anthropic.com>
</commit_message>
<xml_diff>
--- a/documentos_operativos/politicas/INSTRUCCIONES_JACQUELINE_ASISTENCIA_B1_Y_PUNTUALIDAD_2026-10-14.docx
+++ b/documentos_operativos/politicas/INSTRUCCIONES_JACQUELINE_ASISTENCIA_B1_Y_PUNTUALIDAD_2026-10-14.docx
@@ -39,7 +39,7 @@
           <w:color w:val="E54C09"/>
           <w:sz w:val="23"/>
         </w:rPr>
-        <w:t>PARTE 1 — EL B1 DE LA MAÑANA (4 estudiantes): el 1 a 1 lo hace Juan Diego; Jacqueline registra y cierra</w:t>
+        <w:t>PARTE 1 — EL B1 DE LA MAÑANA (4 estudiantes): Juan Diego ya habló con ellos; ahora se mide la asistencia</w:t>
       </w:r>
     </w:p>
     <w:p>
@@ -51,7 +51,7 @@
           <w:b/>
           <w:sz w:val="20"/>
         </w:rPr>
-        <w:t>El grupo cambió de docente el lunes 13 y hay estudiantes que no están llegando. Con 4 estudiantes, cada ausencia es el 25% del grupo. Diana decidió que Juan Diego, que abrió el grupo, hable HOY con cada uno en un 1 a 1 (él tiene su propia hoja). Jacqueline no llama a los estudiantes; hace tres cosas con hora:</w:t>
+        <w:t>El grupo cambió de docente el lunes 13 y hay estudiantes que no están llegando. Con 4 estudiantes, cada ausencia es el 25% del grupo. Juan Diego, que abrió el grupo, ya habló hoy con cada uno (asistencia, tarea, actitud). Lo que sigue es de Jacqueline, con hora:</w:t>
       </w:r>
     </w:p>
     <w:p>
@@ -64,13 +64,13 @@
           <w:b/>
           <w:sz w:val="20"/>
         </w:rPr>
-        <w:t xml:space="preserve">1. Antes de la 1:00 p.m.: </w:t>
+        <w:t xml:space="preserve">1. Hoy: </w:t>
       </w:r>
       <w:r>
         <w:rPr>
           <w:sz w:val="20"/>
         </w:rPr>
-        <w:t>Le pasa a Juan Diego la lista de los 4 con la asistencia del lunes y el martes y el celular de cada uno.</w:t>
+        <w:t>Le pide a Juan Diego una línea por estudiante: qué dijo cada uno y si va mañana a las 8:00. La anota en la tabla de abajo.</w:t>
       </w:r>
     </w:p>
     <w:p>
@@ -83,13 +83,13 @@
           <w:b/>
           <w:sz w:val="20"/>
         </w:rPr>
-        <w:t xml:space="preserve">2. A las 5:00 p.m.: </w:t>
+        <w:t xml:space="preserve">2. Hoy, después de eso: </w:t>
       </w:r>
       <w:r>
         <w:rPr>
           <w:sz w:val="20"/>
         </w:rPr>
-        <w:t>Recibe de Juan Diego, por escrito, una línea por estudiante (causa en sus palabras y si vuelve mañana) y llena la tabla de abajo. Si a las 5:00 no ha llegado, se la pide.</w:t>
+        <w:t>Manda al grupo del B1 el mensaje de abajo.</w:t>
       </w:r>
     </w:p>
     <w:p>
@@ -102,13 +102,13 @@
           <w:b/>
           <w:sz w:val="20"/>
         </w:rPr>
-        <w:t xml:space="preserve">3. Después: </w:t>
+        <w:t xml:space="preserve">3. Mañana 8:00 a.m.: </w:t>
       </w:r>
       <w:r>
         <w:rPr>
           <w:sz w:val="20"/>
         </w:rPr>
-        <w:t>Lo que el 1 a 1 no resuelve lo toma Jacqueline con la tabla de causas: dinero, sin contacto, o un estudiante que escriba después pidiendo cambiar la hora o bajar el ritmo.</w:t>
+        <w:t>Registra quién llegó. Al que no llegue lo llama ella misma a las 9:00 a.m. con las tres preguntas: qué pasó, vuelve mañana, qué le complica. Responde con la tabla de causas.</w:t>
       </w:r>
     </w:p>
     <w:tbl>
@@ -199,7 +199,7 @@
                 <w:color w:val="FFFFFF"/>
                 <w:sz w:val="18"/>
               </w:rPr>
-              <w:t>1 a 1 (hora)</w:t>
+              <w:t>Qué le dijo a Juan Diego</w:t>
             </w:r>
           </w:p>
         </w:tc>
@@ -218,7 +218,7 @@
                 <w:color w:val="FFFFFF"/>
                 <w:sz w:val="18"/>
               </w:rPr>
-              <w:t>Causa (según Juan Diego)</w:t>
+              <w:t>Mié 15 (vino / no)</w:t>
             </w:r>
           </w:p>
         </w:tc>
@@ -237,7 +237,7 @@
                 <w:color w:val="FFFFFF"/>
                 <w:sz w:val="18"/>
               </w:rPr>
-              <w:t>¿Vuelve mañana?</w:t>
+              <w:t>Llamada 9:00 (causa)</w:t>
             </w:r>
           </w:p>
         </w:tc>
@@ -716,7 +716,7 @@
           <w:b/>
           <w:sz w:val="20"/>
         </w:rPr>
-        <w:t>Qué responde Jacqueline según la causa (cuando el estudiante le escriba a ella o cuando Juan Diego le reporte algo pendiente):</w:t>
+        <w:t>Qué responde Jacqueline según la causa (en la llamada de las 9:00 o cuando el estudiante le escriba):</w:t>
       </w:r>
     </w:p>
     <w:tbl>
@@ -800,7 +800,7 @@
               <w:rPr>
                 <w:sz w:val="19"/>
               </w:rPr>
-              <w:t>Lo cierra Juan Diego en el 1 a 1. El docente actual ya se presentó el martes: no se vuelve a presentar ni pide disculpas por nada; al que faltó y vuelve, una frase de bienvenida y a la guía.</w:t>
+              <w:t>Juan Diego ya les habló hoy. El docente actual ya se presentó el martes: no se vuelve a presentar ni pide disculpas por nada; al que faltó y vuelve, una frase de bienvenida y a la guía.</w:t>
             </w:r>
           </w:p>
         </w:tc>
@@ -1036,7 +1036,7 @@
                 <w:b/>
                 <w:sz w:val="19"/>
               </w:rPr>
-              <w:t>Juan Diego no logró contacto hoy ni mañana</w:t>
+              <w:t>No contesta la llamada del jueves</w:t>
             </w:r>
           </w:p>
         </w:tc>
@@ -1052,7 +1052,7 @@
               <w:rPr>
                 <w:sz w:val="19"/>
               </w:rPr>
-              <w:t>Mensaje escrito de Jacqueline el jueves con la frase de garantía y asistencia. Se reporta a Diana como "sin contacto".</w:t>
+              <w:t>Mensaje escrito de Jacqueline ese día con la frase de garantía y asistencia. Se reporta a Diana como "sin contacto".</w:t>
             </w:r>
           </w:p>
         </w:tc>
@@ -1072,7 +1072,7 @@
           <w:b/>
           <w:sz w:val="20"/>
         </w:rPr>
-        <w:t>Mensaje de Jacqueline al grupo del B1 (hoy, después de que Juan Diego reporte los 1 a 1):</w:t>
+        <w:t>Mensaje de Jacqueline al grupo del B1 (hoy):</w:t>
       </w:r>
     </w:p>
     <w:tbl>
@@ -1773,7 +1773,7 @@
                 <w:i/>
                 <w:sz w:val="19"/>
               </w:rPr>
-              <w:t>"B1 mañana: [x]/4 asistieron · 1 a 1 hechos por Juan Diego: [x] · causas: [palabra por cada uno] · docentes a tiempo hoy: [x]/[x]"</w:t>
+              <w:t>"B1 mañana: [x]/4 asistieron · ausentes llamados: [x] · causas: [palabra por cada uno] · docentes a tiempo hoy: [x]/[x]"</w:t>
             </w:r>
           </w:p>
         </w:tc>
@@ -1826,7 +1826,7 @@
         <w:rPr>
           <w:sz w:val="20"/>
         </w:rPr>
-        <w:t>Antes de la 1:00 p.m.: lista de los 4 (asistencia lun/mar + celular) a Juan Diego.</w:t>
+        <w:t>Hoy: pedirle a Juan Diego la línea por estudiante y llenar la tabla.</w:t>
       </w:r>
     </w:p>
     <w:p>
@@ -1845,7 +1845,7 @@
         <w:rPr>
           <w:sz w:val="20"/>
         </w:rPr>
-        <w:t>A las 5:00 p.m.: recibir de Juan Diego la línea por estudiante y llenar la tabla.</w:t>
+        <w:t>Hoy: mensaje al grupo del B1 (Parte 1).</w:t>
       </w:r>
     </w:p>
     <w:p>
@@ -1864,7 +1864,7 @@
         <w:rPr>
           <w:sz w:val="20"/>
         </w:rPr>
-        <w:t>Mensaje al grupo del B1 (Parte 1) hoy, después del reporte de Juan Diego.</w:t>
+        <w:t>Mañana 8:00: registrar quién vino; a las 9:00 llamar a quien no.</w:t>
       </w:r>
     </w:p>
     <w:p>

</xml_diff>